<commit_message>
docs: atualiza monografia AAP2
</commit_message>
<xml_diff>
--- a/docs/Monografia/monografia_aap2.docx
+++ b/docs/Monografia/monografia_aap2.docx
@@ -8514,6 +8514,7 @@
     <w:p>
       <w:pPr>
         <w:spacing w:after="0" w:line="360" w:lineRule="auto"/>
+        <w:ind w:firstLine="708"/>
         <w:textAlignment w:val="baseline"/>
         <w:rPr>
           <w:rFonts w:ascii="Segoe UI" w:hAnsi="Segoe UI" w:cs="Segoe UI"/>
@@ -9819,39 +9820,6 @@
           <w:lang w:eastAsia="pt-BR"/>
         </w:rPr>
       </w:pPr>
-      <w:r>
-        <w:rPr>
-          <w:color w:val="auto"/>
-          <w:lang w:eastAsia="pt-BR"/>
-        </w:rPr>
-        <w:t> </w:t>
-      </w:r>
-    </w:p>
-    <w:p>
-      <w:pPr>
-        <w:spacing w:after="0" w:line="240" w:lineRule="auto"/>
-        <w:textAlignment w:val="baseline"/>
-        <w:rPr>
-          <w:rFonts w:ascii="Segoe UI" w:hAnsi="Segoe UI" w:cs="Segoe UI"/>
-          <w:color w:val="auto"/>
-          <w:sz w:val="18"/>
-          <w:szCs w:val="18"/>
-          <w:lang w:eastAsia="pt-BR"/>
-        </w:rPr>
-      </w:pPr>
-    </w:p>
-    <w:p>
-      <w:pPr>
-        <w:spacing w:after="0" w:line="240" w:lineRule="auto"/>
-        <w:textAlignment w:val="baseline"/>
-        <w:rPr>
-          <w:rFonts w:ascii="Segoe UI" w:hAnsi="Segoe UI" w:cs="Segoe UI"/>
-          <w:color w:val="auto"/>
-          <w:sz w:val="18"/>
-          <w:szCs w:val="18"/>
-          <w:lang w:eastAsia="pt-BR"/>
-        </w:rPr>
-      </w:pPr>
     </w:p>
     <w:p>
       <w:pPr>
@@ -10753,7 +10721,6 @@
                 <w:szCs w:val="20"/>
                 <w:lang w:eastAsia="pt-BR"/>
               </w:rPr>
-              <w:lastRenderedPageBreak/>
               <w:t>Fluxo Alternativo </w:t>
             </w:r>
           </w:p>
@@ -10854,6 +10821,7 @@
                 <w:szCs w:val="20"/>
                 <w:lang w:eastAsia="pt-BR"/>
               </w:rPr>
+              <w:lastRenderedPageBreak/>
               <w:t>O sistema exibe os campos específicos e comuns para o cadastro de Pessoa Física: nome completo, CPF e dados de contato e endereço. </w:t>
             </w:r>
           </w:p>
@@ -11156,6 +11124,7 @@
                 <w:szCs w:val="20"/>
                 <w:lang w:eastAsia="pt-BR"/>
               </w:rPr>
+              <w:lastRenderedPageBreak/>
               <w:t>Fluxos de Exceção </w:t>
             </w:r>
           </w:p>
@@ -12541,7 +12510,6 @@
           <w:color w:val="000000"/>
           <w:lang w:eastAsia="pt-BR"/>
         </w:rPr>
-        <w:lastRenderedPageBreak/>
         <w:t>Quadro 8 – Especificação resumida do caso de uso UC-05 </w:t>
       </w:r>
     </w:p>
@@ -12683,6 +12651,7 @@
                 <w:szCs w:val="18"/>
                 <w:lang w:eastAsia="pt-BR"/>
               </w:rPr>
+              <w:lastRenderedPageBreak/>
               <w:t>Ator</w:t>
             </w:r>
             <w:r>
@@ -14412,7 +14381,6 @@
                 <w:szCs w:val="18"/>
                 <w:lang w:eastAsia="pt-BR"/>
               </w:rPr>
-              <w:lastRenderedPageBreak/>
               <w:t>- Sistema não conclui o primeiro acesso (7 - fluxo principal). </w:t>
             </w:r>
           </w:p>
@@ -14453,6 +14421,7 @@
                 <w:szCs w:val="18"/>
                 <w:lang w:eastAsia="pt-BR"/>
               </w:rPr>
+              <w:lastRenderedPageBreak/>
               <w:t>- Fim. </w:t>
             </w:r>
           </w:p>
@@ -16010,7 +15979,6 @@
                 <w:szCs w:val="20"/>
                 <w:lang w:eastAsia="pt-BR"/>
               </w:rPr>
-              <w:lastRenderedPageBreak/>
               <w:t>Campo</w:t>
             </w:r>
             <w:r>
@@ -16107,6 +16075,7 @@
                 <w:szCs w:val="20"/>
                 <w:lang w:eastAsia="pt-BR"/>
               </w:rPr>
+              <w:lastRenderedPageBreak/>
               <w:t>Ator</w:t>
             </w:r>
             <w:r>
@@ -19402,7 +19371,6 @@
                 <w:szCs w:val="18"/>
                 <w:lang w:val="en-US" w:eastAsia="pt-BR"/>
               </w:rPr>
-              <w:lastRenderedPageBreak/>
               <w:t>Requisitos</w:t>
             </w:r>
             <w:proofErr w:type="spellEnd"/>
@@ -19516,6 +19484,7 @@
                 <w:szCs w:val="18"/>
                 <w:lang w:val="en-US" w:eastAsia="pt-BR"/>
               </w:rPr>
+              <w:lastRenderedPageBreak/>
               <w:t>Prioridade</w:t>
             </w:r>
             <w:proofErr w:type="spellEnd"/>
@@ -21260,7 +21229,6 @@
                 <w:szCs w:val="20"/>
                 <w:lang w:eastAsia="pt-BR"/>
               </w:rPr>
-              <w:lastRenderedPageBreak/>
               <w:t>O sistema valida o acesso conforme o perfil e as permissões do ator </w:t>
             </w:r>
           </w:p>
@@ -21313,6 +21281,7 @@
                 <w:szCs w:val="20"/>
                 <w:lang w:eastAsia="pt-BR"/>
               </w:rPr>
+              <w:lastRenderedPageBreak/>
               <w:t>O sistema apresenta a listagem de clientes cadastrados.  </w:t>
             </w:r>
           </w:p>
@@ -22888,17 +22857,7 @@
                 <w:szCs w:val="20"/>
                 <w:lang w:eastAsia="pt-BR"/>
               </w:rPr>
-              <w:t xml:space="preserve"> No passo 5, o usuário seleciona a opção de consultar o histórico de interações em vez de registrar uma nova interação. O </w:t>
-            </w:r>
-            <w:r>
-              <w:rPr>
-                <w:color w:val="000000"/>
-                <w:sz w:val="20"/>
-                <w:szCs w:val="20"/>
-                <w:lang w:eastAsia="pt-BR"/>
-              </w:rPr>
-              <w:lastRenderedPageBreak/>
-              <w:t>sistema verifica a permissão do usuário para realizar a consulta. O sistema recupera as interações vinculadas ao cliente. O sistema apresenta o histórico de interações em ordem cronológica. O usuário consulta as informações apresentadas. </w:t>
+              <w:t xml:space="preserve"> No passo 5, o usuário seleciona a opção de consultar o histórico de interações em vez de registrar uma nova interação. O sistema verifica a permissão do usuário para realizar a consulta. O sistema recupera as interações vinculadas ao cliente. O sistema apresenta o histórico de interações em ordem cronológica. O usuário consulta as informações apresentadas. </w:t>
             </w:r>
           </w:p>
           <w:p>
@@ -22922,6 +22881,7 @@
                 <w:szCs w:val="20"/>
                 <w:lang w:eastAsia="pt-BR"/>
               </w:rPr>
+              <w:lastRenderedPageBreak/>
               <w:t>A2 – Cancelamento:</w:t>
             </w:r>
             <w:r>
@@ -23716,15 +23676,22 @@
           <w:color w:val="auto"/>
           <w:lang w:eastAsia="pt-BR"/>
         </w:rPr>
+        <w:t>Primeiro Acesso e Recuperação de Senha:</w:t>
+      </w:r>
+      <w:r>
+        <w:rPr>
+          <w:color w:val="auto"/>
+          <w:lang w:eastAsia="pt-BR"/>
+        </w:rPr>
+        <w:t xml:space="preserve"> Ambos os fluxos partem do e-mail cadastrado, verificado na base — se não encontrado, o sistema </w:t>
+      </w:r>
+      <w:r>
+        <w:rPr>
+          <w:color w:val="auto"/>
+          <w:lang w:eastAsia="pt-BR"/>
+        </w:rPr>
         <w:lastRenderedPageBreak/>
-        <w:t>Primeiro Acesso e Recuperação de Senha:</w:t>
-      </w:r>
-      <w:r>
-        <w:rPr>
-          <w:color w:val="auto"/>
-          <w:lang w:eastAsia="pt-BR"/>
-        </w:rPr>
-        <w:t xml:space="preserve"> Ambos os fluxos partem do e-mail cadastrado, verificado na base — se não encontrado, o sistema avisa o usuário. Validado o e-mail, é enviado um link com prazo de validade para definição ou redefinição de senha, com opção de reenvio em caso de expiração; a nova senha é validada e atualizada, redirecionando o usuário ao login. </w:t>
+        <w:t>avisa o usuário. Validado o e-mail, é enviado um link com prazo de validade para definição ou redefinição de senha, com opção de reenvio em caso de expiração; a nova senha é validada e atualizada, redirecionando o usuário ao login. </w:t>
       </w:r>
     </w:p>
     <w:p>
@@ -24113,7 +24080,6 @@
           <w:szCs w:val="20"/>
           <w:lang w:eastAsia="pt-BR"/>
         </w:rPr>
-        <w:lastRenderedPageBreak/>
         <w:t>Fonte: Elaborado pelos próprios autores (2026). </w:t>
       </w:r>
     </w:p>
@@ -24158,6 +24124,7 @@
           <w:color w:val="000000"/>
           <w:lang w:eastAsia="pt-BR"/>
         </w:rPr>
+        <w:lastRenderedPageBreak/>
         <w:t>12.3. Diagrama de sequência do cadastro de cliente, com validação de duplicidade e retorno de erro </w:t>
       </w:r>
     </w:p>

</xml_diff>